<commit_message>
Add MRC pipeline, portable release packaging, and SaperaLT capture support.
Integrate batch MRC processing with optimized alignment, bundled Python runtime resolution, and build-release scripts that package .NET, MRC dependencies, and Sapera components for copy-to-run deployment.

Co-authored-by: Cursor <cursoragent@cursor.com>
</commit_message>
<xml_diff>
--- a/项目手册.docx
+++ b/项目手册.docx
@@ -17597,6 +17597,326 @@
     </w:p>
     <w:bookmarkEnd w:id="0"/>
     <w:bookmarkEnd w:id="45"/>
+    <w:p>
+      <w:pPr>
+        <w:pStyle w:val="4"/>
+      </w:pPr>
+      <w:r>
+        <w:t>当前版本功能手册（完整）</w:t>
+      </w:r>
+    </w:p>
+    <w:p>
+      <w:pPr>
+        <w:pStyle w:val="5"/>
+      </w:pPr>
+      <w:r>
+        <w:t>一、系统功能总览</w:t>
+      </w:r>
+    </w:p>
+    <w:p>
+      <w:pPr>
+        <w:pStyle w:val="3"/>
+      </w:pPr>
+      <w:r>
+        <w:t>本系统为基于 WPF 的图像采集与检测软件，支持 Teledyne DALSA（SaperaLT）采集、图像显示与缩放、灰度化处理、多格式保存、MRC 算法实时处理与离线批处理。</w:t>
+      </w:r>
+    </w:p>
+    <w:p>
+      <w:pPr>
+        <w:pStyle w:val="5"/>
+      </w:pPr>
+      <w:r>
+        <w:t>二、采集与设备配置</w:t>
+      </w:r>
+    </w:p>
+    <w:p>
+      <w:pPr>
+        <w:pStyle w:val="24"/>
+      </w:pPr>
+      <w:r>
+        <w:t>1) 采集源固定为 Teledyne DALSA（SaperaLT）。</w:t>
+      </w:r>
+    </w:p>
+    <w:p>
+      <w:pPr>
+        <w:pStyle w:val="24"/>
+      </w:pPr>
+      <w:r>
+        <w:t>2) 支持 CCF 配置文件选择与应用。</w:t>
+      </w:r>
+    </w:p>
+    <w:p>
+      <w:pPr>
+        <w:pStyle w:val="24"/>
+      </w:pPr>
+      <w:r>
+        <w:t>3) 应用 CCF 流程：停止采集 -&gt; 写入配置 -&gt; 重建采集模块 -&gt; 必要时恢复采集。</w:t>
+      </w:r>
+    </w:p>
+    <w:p>
+      <w:pPr>
+        <w:pStyle w:val="24"/>
+      </w:pPr>
+      <w:r>
+        <w:t>4) 启动后可通过状态栏查看当前分辨率、帧率与运行状态。</w:t>
+      </w:r>
+    </w:p>
+    <w:p>
+      <w:pPr>
+        <w:pStyle w:val="5"/>
+      </w:pPr>
+      <w:r>
+        <w:t>三、图像显示与基础处理</w:t>
+      </w:r>
+    </w:p>
+    <w:p>
+      <w:pPr>
+        <w:pStyle w:val="24"/>
+      </w:pPr>
+      <w:r>
+        <w:t>1) 支持实时图像显示。</w:t>
+      </w:r>
+    </w:p>
+    <w:p>
+      <w:pPr>
+        <w:pStyle w:val="24"/>
+      </w:pPr>
+      <w:r>
+        <w:t>2) 支持放大、缩小、重置视图。</w:t>
+      </w:r>
+    </w:p>
+    <w:p>
+      <w:pPr>
+        <w:pStyle w:val="24"/>
+      </w:pPr>
+      <w:r>
+        <w:t>3) 支持灰度化/恢复彩色切换。</w:t>
+      </w:r>
+    </w:p>
+    <w:p>
+      <w:pPr>
+        <w:pStyle w:val="24"/>
+      </w:pPr>
+      <w:r>
+        <w:t>4) 支持快捷键保存（Ctrl+S）。</w:t>
+      </w:r>
+    </w:p>
+    <w:p>
+      <w:pPr>
+        <w:pStyle w:val="5"/>
+      </w:pPr>
+      <w:r>
+        <w:t>四、图像保存功能</w:t>
+      </w:r>
+    </w:p>
+    <w:p>
+      <w:pPr>
+        <w:pStyle w:val="24"/>
+      </w:pPr>
+      <w:r>
+        <w:t>1) 支持单张保存与批量采集保存。</w:t>
+      </w:r>
+    </w:p>
+    <w:p>
+      <w:pPr>
+        <w:pStyle w:val="24"/>
+      </w:pPr>
+      <w:r>
+        <w:t>2) 保存格式支持：PNG、JPG、TIF、RAW。</w:t>
+      </w:r>
+    </w:p>
+    <w:p>
+      <w:pPr>
+        <w:pStyle w:val="24"/>
+      </w:pPr>
+      <w:r>
+        <w:t>3) RAW 保存时自动输出同名 txt 元数据文件（宽高、通道、位深、步长、字节数等）。</w:t>
+      </w:r>
+    </w:p>
+    <w:p>
+      <w:pPr>
+        <w:pStyle w:val="24"/>
+      </w:pPr>
+      <w:r>
+        <w:t>4) 批量采集可设置数量、保存路径与保存格式。</w:t>
+      </w:r>
+    </w:p>
+    <w:p>
+      <w:pPr>
+        <w:pStyle w:val="5"/>
+      </w:pPr>
+      <w:r>
+        <w:t>五、MRC 算法功能</w:t>
+      </w:r>
+    </w:p>
+    <w:p>
+      <w:pPr>
+        <w:pStyle w:val="24"/>
+      </w:pPr>
+      <w:r>
+        <w:t>1) 已集成 Python 版本 MRC_final 算法。</w:t>
+      </w:r>
+    </w:p>
+    <w:p>
+      <w:pPr>
+        <w:pStyle w:val="24"/>
+      </w:pPr>
+      <w:r>
+        <w:t>2) 支持实时 MRC：采集中可开启/关闭实时处理并回显结果。</w:t>
+      </w:r>
+    </w:p>
+    <w:p>
+      <w:pPr>
+        <w:pStyle w:val="24"/>
+      </w:pPr>
+      <w:r>
+        <w:t>3) 支持文件夹批处理：对已保存图像目录批量执行 MRC。</w:t>
+      </w:r>
+    </w:p>
+    <w:p>
+      <w:pPr>
+        <w:pStyle w:val="24"/>
+      </w:pPr>
+      <w:r>
+        <w:t>4) 批处理输出 mrc_result 与汇总表 mrc_summary.csv。</w:t>
+      </w:r>
+    </w:p>
+    <w:p>
+      <w:pPr>
+        <w:pStyle w:val="24"/>
+      </w:pPr>
+      <w:r>
+        <w:t>5) 提供最小分辨组结果：C_mean &gt; 0.03 且非异常点条件下的有效组结果。</w:t>
+      </w:r>
+    </w:p>
+    <w:p>
+      <w:pPr>
+        <w:pStyle w:val="5"/>
+      </w:pPr>
+      <w:r>
+        <w:t>六、界面操作说明</w:t>
+      </w:r>
+    </w:p>
+    <w:p>
+      <w:pPr>
+        <w:pStyle w:val="6"/>
+      </w:pPr>
+      <w:r>
+        <w:t>采集流程：</w:t>
+      </w:r>
+    </w:p>
+    <w:p>
+      <w:pPr>
+        <w:pStyle w:val="24"/>
+      </w:pPr>
+      <w:r>
+        <w:t>1) 选择或确认 CCF 配置。</w:t>
+      </w:r>
+    </w:p>
+    <w:p>
+      <w:pPr>
+        <w:pStyle w:val="24"/>
+      </w:pPr>
+      <w:r>
+        <w:t>2) 点击开始采集。</w:t>
+      </w:r>
+    </w:p>
+    <w:p>
+      <w:pPr>
+        <w:pStyle w:val="24"/>
+      </w:pPr>
+      <w:r>
+        <w:t>3) 根据需要执行灰度化、保存、实时 MRC。</w:t>
+      </w:r>
+    </w:p>
+    <w:p>
+      <w:pPr>
+        <w:pStyle w:val="24"/>
+      </w:pPr>
+      <w:r>
+        <w:t>4) 完成后点击停止采集。</w:t>
+      </w:r>
+    </w:p>
+    <w:p>
+      <w:pPr>
+        <w:pStyle w:val="6"/>
+      </w:pPr>
+      <w:r>
+        <w:t>MRC 文件夹处理流程：</w:t>
+      </w:r>
+    </w:p>
+    <w:p>
+      <w:pPr>
+        <w:pStyle w:val="24"/>
+      </w:pPr>
+      <w:r>
+        <w:t>1) 选择 MRC 图像文件夹。</w:t>
+      </w:r>
+    </w:p>
+    <w:p>
+      <w:pPr>
+        <w:pStyle w:val="24"/>
+      </w:pPr>
+      <w:r>
+        <w:t>2) 点击处理文件夹并等待完成。</w:t>
+      </w:r>
+    </w:p>
+    <w:p>
+      <w:pPr>
+        <w:pStyle w:val="24"/>
+      </w:pPr>
+      <w:r>
+        <w:t>3) 在输出目录查看标注图、结果表与汇总 CSV。</w:t>
+      </w:r>
+    </w:p>
+    <w:p>
+      <w:pPr>
+        <w:pStyle w:val="5"/>
+      </w:pPr>
+      <w:r>
+        <w:t>七、注意事项</w:t>
+      </w:r>
+    </w:p>
+    <w:p>
+      <w:pPr>
+        <w:pStyle w:val="24"/>
+      </w:pPr>
+      <w:r>
+        <w:t>1) 使用前需确保 Python 与依赖包安装完整。</w:t>
+      </w:r>
+    </w:p>
+    <w:p>
+      <w:pPr>
+        <w:pStyle w:val="24"/>
+      </w:pPr>
+      <w:r>
+        <w:t>2) CCF 文件需与当前相机及驱动环境匹配。</w:t>
+      </w:r>
+    </w:p>
+    <w:p>
+      <w:pPr>
+        <w:pStyle w:val="24"/>
+      </w:pPr>
+      <w:r>
+        <w:t>3) Device Index 在不同软件中可能不同，建议在本系统内验证可用索引。</w:t>
+      </w:r>
+    </w:p>
+    <w:p>
+      <w:pPr>
+        <w:pStyle w:val="24"/>
+      </w:pPr>
+      <w:r>
+        <w:t>4) RAW 为无头原始数据，需结合同名元数据文件解析。</w:t>
+      </w:r>
+    </w:p>
+    <w:p>
+      <w:pPr>
+        <w:pStyle w:val="24"/>
+      </w:pPr>
+      <w:r>
+        <w:t>5) 若采集失败，优先检查：驱动、CCF 路径、Server Name、设备索引、采集卡占用状态。</w:t>
+      </w:r>
+    </w:p>
     <w:sectPr>
       <w:footnotePr>
         <w:numRestart w:val="eachSect"/>

</xml_diff>